<commit_message>
fix(medic8): de-bold structural labels in ERD Section 10 and Section 12 stubs
Co-Authored-By: Claude Sonnet 4.6 <noreply@anthropic.com>
</commit_message>
<xml_diff>
--- a/projects/Medic8/03-design-documentation/Medic8_ERD.docx
+++ b/projects/Medic8/03-design-documentation/Medic8_ERD.docx
@@ -28,7 +28,7 @@
         </w:p>
       </w:sdtContent>
     </w:sdt>
-    <w:bookmarkStart w:id="104" w:name="X4112fb31584050d1dfa86f313f1f4ab3e3bcf5f"/>
+    <w:bookmarkStart w:id="109" w:name="X4112fb31584050d1dfa86f313f1f4ab3e3bcf5f"/>
     <w:p>
       <w:pPr>
         <w:pStyle w:val="Heading1"/>
@@ -5618,10 +5618,6 @@
         <w:pStyle w:val="BodyText"/>
       </w:pPr>
       <w:r>
-        <w:rPr>
-          <w:b/>
-          <w:bCs/>
-        </w:rPr>
         <w:t xml:space="preserve">Composite unique constraint:</w:t>
       </w:r>
       <w:r>
@@ -7861,10 +7857,6 @@
         <w:pStyle w:val="BodyText"/>
       </w:pPr>
       <w:r>
-        <w:rPr>
-          <w:b/>
-          <w:bCs/>
-        </w:rPr>
         <w:t xml:space="preserve">Composite unique constraint:</w:t>
       </w:r>
       <w:r>
@@ -8318,10 +8310,6 @@
         <w:pStyle w:val="BodyText"/>
       </w:pPr>
       <w:r>
-        <w:rPr>
-          <w:b/>
-          <w:bCs/>
-        </w:rPr>
         <w:t xml:space="preserve">Composite unique constraint:</w:t>
       </w:r>
       <w:r>
@@ -10616,10 +10604,6 @@
         <w:pStyle w:val="BodyText"/>
       </w:pPr>
       <w:r>
-        <w:rPr>
-          <w:b/>
-          <w:bCs/>
-        </w:rPr>
         <w:t xml:space="preserve">Index:</w:t>
       </w:r>
       <w:r>
@@ -13038,10 +13022,6 @@
         <w:pStyle w:val="BodyText"/>
       </w:pPr>
       <w:r>
-        <w:rPr>
-          <w:b/>
-          <w:bCs/>
-        </w:rPr>
         <w:t xml:space="preserve">Composite unique constraint:</w:t>
       </w:r>
       <w:r>
@@ -13065,10 +13045,6 @@
         <w:pStyle w:val="BodyText"/>
       </w:pPr>
       <w:r>
-        <w:rPr>
-          <w:b/>
-          <w:bCs/>
-        </w:rPr>
         <w:t xml:space="preserve">Index:</w:t>
       </w:r>
       <w:r>
@@ -16096,10 +16072,6 @@
         <w:pStyle w:val="BodyText"/>
       </w:pPr>
       <w:r>
-        <w:rPr>
-          <w:b/>
-          <w:bCs/>
-        </w:rPr>
         <w:t xml:space="preserve">Index:</w:t>
       </w:r>
       <w:r>
@@ -21211,10 +21183,6 @@
         <w:pStyle w:val="BodyText"/>
       </w:pPr>
       <w:r>
-        <w:rPr>
-          <w:b/>
-          <w:bCs/>
-        </w:rPr>
         <w:t xml:space="preserve">Index:</w:t>
       </w:r>
       <w:r>
@@ -23135,10 +23103,6 @@
         <w:pStyle w:val="BodyText"/>
       </w:pPr>
       <w:r>
-        <w:rPr>
-          <w:b/>
-          <w:bCs/>
-        </w:rPr>
         <w:t xml:space="preserve">Index:</w:t>
       </w:r>
       <w:r>
@@ -27159,10 +27123,6 @@
         <w:pStyle w:val="BodyText"/>
       </w:pPr>
       <w:r>
-        <w:rPr>
-          <w:b/>
-          <w:bCs/>
-        </w:rPr>
         <w:t xml:space="preserve">Index:</w:t>
       </w:r>
       <w:r>
@@ -28318,10 +28278,6 @@
         <w:pStyle w:val="BodyText"/>
       </w:pPr>
       <w:r>
-        <w:rPr>
-          <w:b/>
-          <w:bCs/>
-        </w:rPr>
         <w:t xml:space="preserve">Composite unique constraint:</w:t>
       </w:r>
       <w:r>
@@ -32601,10 +32557,6 @@
         <w:pStyle w:val="BodyText"/>
       </w:pPr>
       <w:r>
-        <w:rPr>
-          <w:b/>
-          <w:bCs/>
-        </w:rPr>
         <w:t xml:space="preserve">Composite unique constraint:</w:t>
       </w:r>
       <w:r>
@@ -34260,10 +34212,6 @@
         <w:pStyle w:val="BodyText"/>
       </w:pPr>
       <w:r>
-        <w:rPr>
-          <w:b/>
-          <w:bCs/>
-        </w:rPr>
         <w:t xml:space="preserve">Index:</w:t>
       </w:r>
       <w:r>
@@ -35210,10 +35158,6 @@
         <w:pStyle w:val="BodyText"/>
       </w:pPr>
       <w:r>
-        <w:rPr>
-          <w:b/>
-          <w:bCs/>
-        </w:rPr>
         <w:t xml:space="preserve">Index:</w:t>
       </w:r>
       <w:r>
@@ -35843,10 +35787,6 @@
         <w:pStyle w:val="BodyText"/>
       </w:pPr>
       <w:r>
-        <w:rPr>
-          <w:b/>
-          <w:bCs/>
-        </w:rPr>
         <w:t xml:space="preserve">Composite unique constraint:</w:t>
       </w:r>
       <w:r>
@@ -36968,10 +36908,6 @@
         <w:pStyle w:val="BodyText"/>
       </w:pPr>
       <w:r>
-        <w:rPr>
-          <w:b/>
-          <w:bCs/>
-        </w:rPr>
         <w:t xml:space="preserve">Composite unique constraint:</w:t>
       </w:r>
       <w:r>
@@ -37710,10 +37646,6 @@
         <w:pStyle w:val="BodyText"/>
       </w:pPr>
       <w:r>
-        <w:rPr>
-          <w:b/>
-          <w:bCs/>
-        </w:rPr>
         <w:t xml:space="preserve">Index:</w:t>
       </w:r>
       <w:r>
@@ -38387,17 +38319,7 @@
         <w:pStyle w:val="BodyText"/>
       </w:pPr>
       <w:r>
-        <w:rPr>
-          <w:b/>
-          <w:bCs/>
-        </w:rPr>
-        <w:t xml:space="preserve">Note:</w:t>
-      </w:r>
-      <w:r>
-        <w:t xml:space="preserve"> </w:t>
-      </w:r>
-      <w:r>
-        <w:t xml:space="preserve">The</w:t>
+        <w:t xml:space="preserve">Note: The</w:t>
       </w:r>
       <w:r>
         <w:t xml:space="preserve"> </w:t>
@@ -38817,10 +38739,6 @@
         <w:pStyle w:val="BodyText"/>
       </w:pPr>
       <w:r>
-        <w:rPr>
-          <w:b/>
-          <w:bCs/>
-        </w:rPr>
         <w:t xml:space="preserve">Composite unique constraint:</w:t>
       </w:r>
       <w:r>
@@ -40793,7 +40711,7 @@
     </w:p>
     <w:bookmarkEnd w:id="94"/>
     <w:bookmarkEnd w:id="95"/>
-    <w:bookmarkStart w:id="98" w:name="X9221999fa0f756430d33a6a31260f826f91d01e"/>
+    <w:bookmarkStart w:id="103" w:name="X9221999fa0f756430d33a6a31260f826f91d01e"/>
     <w:p>
       <w:pPr>
         <w:pStyle w:val="Heading2"/>
@@ -40810,7 +40728,7 @@
         <w:t xml:space="preserve">The following tables are identified for future phases. Column definitions will be specified at the start of each phase.</w:t>
       </w:r>
     </w:p>
-    <w:bookmarkStart w:id="96" w:name="X59ca9adbbc1a138ca324ed52ed278898157711a"/>
+    <w:bookmarkStart w:id="99" w:name="X59ca9adbbc1a138ca324ed52ed278898157711a"/>
     <w:p>
       <w:pPr>
         <w:pStyle w:val="Heading3"/>
@@ -40819,16 +40737,13 @@
         <w:t xml:space="preserve">12.1 Phase 3 — Programmes and Patient Engagement</w:t>
       </w:r>
     </w:p>
+    <w:bookmarkStart w:id="96" w:name="hivaids-programme"/>
     <w:p>
       <w:pPr>
-        <w:pStyle w:val="FirstParagraph"/>
+        <w:pStyle w:val="Heading4"/>
       </w:pPr>
       <w:r>
-        <w:rPr>
-          <w:b/>
-          <w:bCs/>
-        </w:rPr>
-        <w:t xml:space="preserve">HIV/AIDS Programme:</w:t>
+        <w:t xml:space="preserve">HIV/AIDS Programme</w:t>
       </w:r>
     </w:p>
     <w:p>
@@ -40894,16 +40809,14 @@
         <w:t xml:space="preserve">— Viral load test tracking with suppression status classification</w:t>
       </w:r>
     </w:p>
+    <w:bookmarkEnd w:id="96"/>
+    <w:bookmarkStart w:id="97" w:name="tb-programme"/>
     <w:p>
       <w:pPr>
-        <w:pStyle w:val="FirstParagraph"/>
+        <w:pStyle w:val="Heading4"/>
       </w:pPr>
       <w:r>
-        <w:rPr>
-          <w:b/>
-          <w:bCs/>
-        </w:rPr>
-        <w:t xml:space="preserve">TB Programme:</w:t>
+        <w:t xml:space="preserve">TB Programme</w:t>
       </w:r>
     </w:p>
     <w:p>
@@ -40969,16 +40882,14 @@
         <w:t xml:space="preserve">— Directly Observed Therapy daily record with observer and adherence status</w:t>
       </w:r>
     </w:p>
+    <w:bookmarkEnd w:id="97"/>
+    <w:bookmarkStart w:id="98" w:name="patient-portal"/>
     <w:p>
       <w:pPr>
-        <w:pStyle w:val="FirstParagraph"/>
+        <w:pStyle w:val="Heading4"/>
       </w:pPr>
       <w:r>
-        <w:rPr>
-          <w:b/>
-          <w:bCs/>
-        </w:rPr>
-        <w:t xml:space="preserve">Patient Portal:</w:t>
+        <w:t xml:space="preserve">Patient Portal</w:t>
       </w:r>
     </w:p>
     <w:p>
@@ -41032,8 +40943,9 @@
         <w:t xml:space="preserve">— Patient app session tracking with device and platform metadata</w:t>
       </w:r>
     </w:p>
-    <w:bookmarkEnd w:id="96"/>
-    <w:bookmarkStart w:id="97" w:name="X8e8612dc37fd44006a635ea92725a75b523a41e"/>
+    <w:bookmarkEnd w:id="98"/>
+    <w:bookmarkEnd w:id="99"/>
+    <w:bookmarkStart w:id="102" w:name="X8e8612dc37fd44006a635ea92725a75b523a41e"/>
     <w:p>
       <w:pPr>
         <w:pStyle w:val="Heading3"/>
@@ -41042,16 +40954,13 @@
         <w:t xml:space="preserve">12.2 Phase 4 — Advanced Specialty</w:t>
       </w:r>
     </w:p>
+    <w:bookmarkStart w:id="100" w:name="theatre-and-surgical-management"/>
     <w:p>
       <w:pPr>
-        <w:pStyle w:val="FirstParagraph"/>
+        <w:pStyle w:val="Heading4"/>
       </w:pPr>
       <w:r>
-        <w:rPr>
-          <w:b/>
-          <w:bCs/>
-        </w:rPr>
-        <w:t xml:space="preserve">Theatre and Surgical Management:</w:t>
+        <w:t xml:space="preserve">Theatre and Surgical Management</w:t>
       </w:r>
     </w:p>
     <w:p>
@@ -41117,16 +41026,14 @@
         <w:t xml:space="preserve">— Anaesthesia induction, maintenance, and recovery documentation</w:t>
       </w:r>
     </w:p>
+    <w:bookmarkEnd w:id="100"/>
+    <w:bookmarkStart w:id="101" w:name="blood-bank-and-transfusion"/>
     <w:p>
       <w:pPr>
-        <w:pStyle w:val="FirstParagraph"/>
+        <w:pStyle w:val="Heading4"/>
       </w:pPr>
       <w:r>
-        <w:rPr>
-          <w:b/>
-          <w:bCs/>
-        </w:rPr>
-        <w:t xml:space="preserve">Blood Bank and Transfusion:</w:t>
+        <w:t xml:space="preserve">Blood Bank and Transfusion</w:t>
       </w:r>
     </w:p>
     <w:p>
@@ -41199,9 +41106,10 @@
         </w:pict>
       </w:r>
     </w:p>
-    <w:bookmarkEnd w:id="97"/>
-    <w:bookmarkEnd w:id="98"/>
-    <w:bookmarkStart w:id="103" w:name="Xafb283b07b51ead7435f19c4125d8b351b941bd"/>
+    <w:bookmarkEnd w:id="101"/>
+    <w:bookmarkEnd w:id="102"/>
+    <w:bookmarkEnd w:id="103"/>
+    <w:bookmarkStart w:id="108" w:name="Xafb283b07b51ead7435f19c4125d8b351b941bd"/>
     <w:p>
       <w:pPr>
         <w:pStyle w:val="Heading2"/>
@@ -41210,7 +41118,7 @@
         <w:t xml:space="preserve">13. Indexing Strategy</w:t>
       </w:r>
     </w:p>
-    <w:bookmarkStart w:id="99" w:name="X8b365f4e6c3cdaeaaf2d9643e672bcb7654f6c6"/>
+    <w:bookmarkStart w:id="104" w:name="X8b365f4e6c3cdaeaaf2d9643e672bcb7654f6c6"/>
     <w:p>
       <w:pPr>
         <w:pStyle w:val="Heading3"/>
@@ -41257,8 +41165,8 @@
         <w:t xml:space="preserve">leads all composite indexes to ensure the query planner uses tenant isolation as the first filter.</w:t>
       </w:r>
     </w:p>
-    <w:bookmarkEnd w:id="99"/>
-    <w:bookmarkStart w:id="100" w:name="X27bb3b8036f6139ef828bd56236dda9f57f2a9c"/>
+    <w:bookmarkEnd w:id="104"/>
+    <w:bookmarkStart w:id="105" w:name="X27bb3b8036f6139ef828bd56236dda9f57f2a9c"/>
     <w:p>
       <w:pPr>
         <w:pStyle w:val="Heading3"/>
@@ -42057,8 +41965,8 @@
         </w:tc>
       </w:tr>
     </w:tbl>
-    <w:bookmarkEnd w:id="100"/>
-    <w:bookmarkStart w:id="101" w:name="X15852e0ce96256a463eb6f8ac5aa1e29d092a33"/>
+    <w:bookmarkEnd w:id="105"/>
+    <w:bookmarkStart w:id="106" w:name="X15852e0ce96256a463eb6f8ac5aa1e29d092a33"/>
     <w:p>
       <w:pPr>
         <w:pStyle w:val="Heading3"/>
@@ -42193,8 +42101,8 @@
         </w:tc>
       </w:tr>
     </w:tbl>
-    <w:bookmarkEnd w:id="101"/>
-    <w:bookmarkStart w:id="102" w:name="Xc9d0c7034a8f4da8e5968bb0a8bcf332be5ca05"/>
+    <w:bookmarkEnd w:id="106"/>
+    <w:bookmarkStart w:id="107" w:name="Xc9d0c7034a8f4da8e5968bb0a8bcf332be5ca05"/>
     <w:p>
       <w:pPr>
         <w:pStyle w:val="Heading3"/>
@@ -42747,9 +42655,9 @@
         </w:tc>
       </w:tr>
     </w:tbl>
-    <w:bookmarkEnd w:id="102"/>
-    <w:bookmarkEnd w:id="103"/>
-    <w:bookmarkEnd w:id="104"/>
+    <w:bookmarkEnd w:id="107"/>
+    <w:bookmarkEnd w:id="108"/>
+    <w:bookmarkEnd w:id="109"/>
     <w:sectPr>
       <w:footerReference r:id="rId9" w:type="default"/>
       <w:headerReference r:id="rId10" w:type="default"/>

</xml_diff>